<commit_message>
docs: align requirements and brandbook with official PDFs
</commit_message>
<xml_diff>
--- a/brandbook/ryadom-brandbook.docx
+++ b/brandbook/ryadom-brandbook.docx
@@ -28,7 +28,7 @@
           <w:color w:val="5C616A"/>
           <w:sz w:val="17"/>
         </w:rPr>
-        <w:t>Версия 1.1  •  19 октября 2026</w:t>
+        <w:t>Версия 1.2  •  19 октября 2026</w:t>
       </w:r>
     </w:p>
     <w:p>
@@ -75,7 +75,7 @@
         <w:rPr>
           <w:b w:val="0"/>
         </w:rPr>
-        <w:t>Рядом помогает находить людей для совместных занятий и встреч. Спорт становится первым направлением, а общая система поддерживает прогулки, игры, обучение и другие интересы.</w:t>
+        <w:t>Рядом помогает находить компанию для совместных занятий разными видами спорта. Обязательная основа кейса — адаптивный веб. Расширение на прогулки, обучение и другие интересы остаётся идеей команды.</w:t>
       </w:r>
     </w:p>
     <w:p>
@@ -571,7 +571,7 @@
         <w:rPr>
           <w:b w:val="0"/>
         </w:rPr>
-        <w:t>Используем «Рядом» и названия категорий: Бег, Прогулки, Игры, Обучение. Категории различаем текстом и иконкой, сохраняя общие цвета и компоненты. Отдельные логотипы для каждого направления не нужны.</w:t>
+        <w:t>Используем «Рядом» и названия направлений: Бег, Футбол, Шахматы. Даём выбрать свой вид спорта без изменения кода. Категории различаем текстом и иконкой; общие цвета и компоненты сохраняются. Другие интересы — возможное развитие.</w:t>
       </w:r>
     </w:p>
     <w:p>
@@ -4100,7 +4100,7 @@
         <w:rPr>
           <w:b w:val="0"/>
         </w:rPr>
-        <w:t>Обязательные поля: название, категория, время и часовой пояс при необходимости, место, темп или формат, участники и вместимость, организатор, стоимость либо «Бесплатно». Если условия неизвестны, показываем это явно. Для неспортивных встреч «темп» заменяется подходящим описанием формата.</w:t>
+        <w:t>Обязательны название, описание, вид спорта, дата, время, место, условия и режим записи, организатор со ссылкой на профиль или страницу. Часовой пояс, стоимость, темп и вместимость — дополнительные поля по ситуации. Условия неизвестны — сообщаем явно.</w:t>
       </w:r>
     </w:p>
     <w:p>
@@ -4577,7 +4577,7 @@
                 <w:color w:val="FFFFFF"/>
                 <w:sz w:val="18"/>
               </w:rPr>
-              <w:t>Контекст</w:t>
+              <w:t>Роль</w:t>
             </w:r>
           </w:p>
         </w:tc>
@@ -4609,7 +4609,7 @@
                 <w:color w:val="FFFFFF"/>
                 <w:sz w:val="18"/>
               </w:rPr>
-              <w:t>Что важно человеку</w:t>
+              <w:t>Что важно</w:t>
             </w:r>
           </w:p>
         </w:tc>
@@ -4678,7 +4678,7 @@
                 <w:color w:val="17191D"/>
                 <w:sz w:val="18"/>
               </w:rPr>
-              <w:t>Участник</w:t>
+              <w:t>Пользователь</w:t>
             </w:r>
           </w:p>
         </w:tc>
@@ -4710,7 +4710,7 @@
                 <w:color w:val="17191D"/>
                 <w:sz w:val="18"/>
               </w:rPr>
-              <w:t>Условия встречи и результат участия</w:t>
+              <w:t>Условия, участие, свои встречи</w:t>
             </w:r>
           </w:p>
         </w:tc>
@@ -4742,7 +4742,7 @@
                 <w:color w:val="17191D"/>
                 <w:sz w:val="18"/>
               </w:rPr>
-              <w:t>Присоединиться, подать заявку, уточнить условия</w:t>
+              <w:t>Присоединиться, создать встречу, ответить</w:t>
             </w:r>
           </w:p>
         </w:tc>
@@ -4779,7 +4779,7 @@
                 <w:color w:val="17191D"/>
                 <w:sz w:val="18"/>
               </w:rPr>
-              <w:t>Организатор</w:t>
+              <w:t>Организация</w:t>
             </w:r>
           </w:p>
         </w:tc>
@@ -4811,7 +4811,7 @@
                 <w:color w:val="17191D"/>
                 <w:sz w:val="18"/>
               </w:rPr>
-              <w:t>Содержание встречи, состав и заявки</w:t>
+              <w:t>Допуск, страница, свои события</w:t>
             </w:r>
           </w:p>
         </w:tc>
@@ -4843,7 +4843,7 @@
                 <w:color w:val="17191D"/>
                 <w:sz w:val="18"/>
               </w:rPr>
-              <w:t>Создать встречу, посмотреть заявки, снять с публикации</w:t>
+              <w:t>Отправить на проверку, опубликовать</w:t>
             </w:r>
           </w:p>
         </w:tc>
@@ -4880,7 +4880,7 @@
                 <w:color w:val="17191D"/>
                 <w:sz w:val="18"/>
               </w:rPr>
-              <w:t>Организация</w:t>
+              <w:t>Администратор</w:t>
             </w:r>
           </w:p>
         </w:tc>
@@ -4912,7 +4912,7 @@
                 <w:color w:val="17191D"/>
                 <w:sz w:val="18"/>
               </w:rPr>
-              <w:t>Статус допуска и публикация событий</w:t>
+              <w:t>Допуск и модерация</w:t>
             </w:r>
           </w:p>
         </w:tc>
@@ -4944,108 +4944,7 @@
                 <w:color w:val="17191D"/>
                 <w:sz w:val="18"/>
               </w:rPr>
-              <w:t>Отправить на проверку, посмотреть решение</w:t>
-            </w:r>
-          </w:p>
-        </w:tc>
-      </w:tr>
-      <w:tr>
-        <w:trPr>
-          <w:cantSplit/>
-        </w:trPr>
-        <w:tc>
-          <w:tcPr>
-            <w:tcW w:type="dxa" w:w="1871"/>
-            <w:vAlign w:val="center"/>
-            <w:shd w:fill="F6F7F9"/>
-            <w:tcBorders>
-              <w:top w:val="single" w:sz="5" w:color="D9D9D9"/>
-              <w:left w:val="single" w:sz="5" w:color="D9D9D9"/>
-              <w:bottom w:val="single" w:sz="5" w:color="D9D9D9"/>
-              <w:right w:val="single" w:sz="5" w:color="D9D9D9"/>
-            </w:tcBorders>
-            <w:tcMar>
-              <w:top w:w="95" w:type="dxa"/>
-              <w:left w:w="95" w:type="dxa"/>
-              <w:bottom w:w="95" w:type="dxa"/>
-              <w:right w:w="95" w:type="dxa"/>
-            </w:tcMar>
-          </w:tcPr>
-          <w:p>
-            <w:pPr>
-              <w:spacing w:after="20" w:before="20" w:line="283" w:lineRule="auto"/>
-            </w:pPr>
-            <w:r>
-              <w:rPr>
-                <w:b w:val="0"/>
-                <w:color w:val="17191D"/>
-                <w:sz w:val="18"/>
-              </w:rPr>
-              <w:t>Проверяющий</w:t>
-            </w:r>
-          </w:p>
-        </w:tc>
-        <w:tc>
-          <w:tcPr>
-            <w:tcW w:type="dxa" w:w="3572"/>
-            <w:vAlign w:val="center"/>
-            <w:shd w:fill="F6F7F9"/>
-            <w:tcBorders>
-              <w:top w:val="single" w:sz="5" w:color="D9D9D9"/>
-              <w:left w:val="single" w:sz="5" w:color="D9D9D9"/>
-              <w:bottom w:val="single" w:sz="5" w:color="D9D9D9"/>
-              <w:right w:val="single" w:sz="5" w:color="D9D9D9"/>
-            </w:tcBorders>
-            <w:tcMar>
-              <w:top w:w="95" w:type="dxa"/>
-              <w:left w:w="95" w:type="dxa"/>
-              <w:bottom w:w="95" w:type="dxa"/>
-              <w:right w:w="95" w:type="dxa"/>
-            </w:tcMar>
-          </w:tcPr>
-          <w:p>
-            <w:pPr>
-              <w:spacing w:after="20" w:before="20" w:line="283" w:lineRule="auto"/>
-            </w:pPr>
-            <w:r>
-              <w:rPr>
-                <w:b w:val="0"/>
-                <w:color w:val="17191D"/>
-                <w:sz w:val="18"/>
-              </w:rPr>
-              <w:t>Основания решения и следующий шаг</w:t>
-            </w:r>
-          </w:p>
-        </w:tc>
-        <w:tc>
-          <w:tcPr>
-            <w:tcW w:type="dxa" w:w="4479"/>
-            <w:vAlign w:val="center"/>
-            <w:shd w:fill="F6F7F9"/>
-            <w:tcBorders>
-              <w:top w:val="single" w:sz="5" w:color="D9D9D9"/>
-              <w:left w:val="single" w:sz="5" w:color="D9D9D9"/>
-              <w:bottom w:val="single" w:sz="5" w:color="D9D9D9"/>
-              <w:right w:val="single" w:sz="5" w:color="D9D9D9"/>
-            </w:tcBorders>
-            <w:tcMar>
-              <w:top w:w="95" w:type="dxa"/>
-              <w:left w:w="95" w:type="dxa"/>
-              <w:bottom w:w="95" w:type="dxa"/>
-              <w:right w:w="95" w:type="dxa"/>
-            </w:tcMar>
-          </w:tcPr>
-          <w:p>
-            <w:pPr>
-              <w:spacing w:after="20" w:before="20" w:line="283" w:lineRule="auto"/>
-            </w:pPr>
-            <w:r>
-              <w:rPr>
-                <w:b w:val="0"/>
-                <w:color w:val="17191D"/>
-                <w:sz w:val="18"/>
-              </w:rPr>
-              <w:t>Предоставить допуск, запросить уточнения</w:t>
+              <w:t>Одобрить, отклонить с причиной, снять публикацию</w:t>
             </w:r>
           </w:p>
         </w:tc>
@@ -5074,7 +4973,7 @@
         <w:rPr>
           <w:b w:val="0"/>
         </w:rPr>
-        <w:t>Один человек может участвовать в одной встрече и организовывать другую. Показываем доступные действия в контексте встречи или организации. Не создаём отдельные визуальные бренды для каждого типа кабинета.</w:t>
+        <w:t>Организатор — автор встречи, пользователь или организация, а не четвёртая роль. Он решает по заявкам участников; администратор не подменяет его. Три роли сохраняют общий визуальный язык.</w:t>
       </w:r>
     </w:p>
     <w:p>
@@ -5135,7 +5034,7 @@
           <w:color w:val="5C616A"/>
           <w:sz w:val="17"/>
         </w:rPr>
-        <w:t>Роли и конкретные действия кабинетов — предлагаемая модель для проектирования. Её связывают с правилами допуска и публикации при детализации продукта.</w:t>
+        <w:t>Три роли заданы постановкой. В административном контуре нужны поиск, переходы к связанным данным, допуск организаций, модерация событий и отдельных сообщений.</w:t>
       </w:r>
     </w:p>
     <w:p>
@@ -5892,7 +5791,7 @@
           <w:color w:val="5C616A"/>
           <w:sz w:val="17"/>
         </w:rPr>
-        <w:t>Имена состояний в states.json относятся к визуальной системе. Серверные переходы и права задаются отдельно. Набор допуска включает вариант запроса уточнений.</w:t>
+        <w:t>Подписи в states.json задают оформление. Отказ в допуске требует причины. «Нужны уточнения» — дополнительная функция, не обязательный этап допуска.</w:t>
       </w:r>
     </w:p>
     <w:p>
@@ -6006,7 +5905,7 @@
         <w:rPr>
           <w:b w:val="0"/>
         </w:rPr>
-        <w:t>До отправки объясняем, какие данные нужны. После отправки показываем «На проверке» и место появления решения. Если публикация зависит от допуска, объяснение находится рядом с действием. Возможность сохранения черновика в таком состоянии — предлагаемый вариант поведения.</w:t>
+        <w:t>До допуска страница организации не публична, публикации от её имени недоступны. Администратор одобряет или отказывает с причиной. После допуска страница публична, события выходят сразу без повторного согласования. Черновик — дополнительная возможность.</w:t>
       </w:r>
     </w:p>
     <w:p>
@@ -6035,7 +5934,7 @@
           <w:color w:val="5C616A"/>
           <w:sz w:val="17"/>
         </w:rPr>
-        <w:t>Сценарии 1 и 2. Состав полей и правила публикации обычным пользователем уточняются в продуктовой спецификации; визуальная система поддерживает выбранные правила.</w:t>
+        <w:t>Сценарии 1 и 2. Пользователь публикует от своего имени. Обязательны готовые направления и свой вид спорта без правки кода; событие видит другой пользователь.</w:t>
       </w:r>
     </w:p>
     <w:p>
@@ -6117,7 +6016,7 @@
         <w:rPr>
           <w:b w:val="0"/>
         </w:rPr>
-        <w:t>Основная кнопка — «Присоединиться». После подтверждения показываем «Ты участвуешь». Если мест нет, явно сообщаем «Нет мест». Во время отправки сохраняем размер кнопки и не допускаем повторного действия.</w:t>
+        <w:t>Основная кнопка — «Присоединиться». Запись сразу подтверждена, автор видит участника. Во время отправки сохраняем размер кнопки и предотвращаем дубли. Если добавлен лимит, отсутствие мест показываем явно; сам лимит необязателен.</w:t>
       </w:r>
     </w:p>
     <w:p>
@@ -6178,7 +6077,7 @@
           <w:color w:val="5C616A"/>
           <w:sz w:val="17"/>
         </w:rPr>
-        <w:t>Сценарии 3 и 4. Макет демонстрирует различие способов участия; подтверждение, отказ и отзыв должны соответствовать согласованным продуктовым правилам.</w:t>
+        <w:t>Сценарии 3 и 4. Оба режима обязательны. Принятие и отказ обновляются у обеих сторон. Вместимость в макете и отзыв заявки — дополнительные возможности.</w:t>
       </w:r>
     </w:p>
     <w:p>
@@ -6260,7 +6159,7 @@
         <w:rPr>
           <w:b w:val="0"/>
         </w:rPr>
-        <w:t>Предлагаемый вариант — раздел вопросов на странице встречи. Действие «Уточнить условия» открывает контекст встречи, «Задать вопрос» отправляет текст. Показываем автора ответа и сохраняем связь с конкретной встречей. Отправку вопроса не обозначаем как получение ответа.</w:t>
+        <w:t>Обязательно текстовое обсуждение внутри встречи: пользователь задаёт вопрос, автор отвечает, сообщения и авторство сохраняются. Комментариев достаточно; внешний чат может дополнять обсуждение. Отправка вопроса не означает получение ответа.</w:t>
       </w:r>
     </w:p>
     <w:p>
@@ -6268,7 +6167,7 @@
         <w:rPr>
           <w:b w:val="0"/>
         </w:rPr>
-        <w:t>Общие вопросы можно показывать всем, если это поддерживает выбранная модель общения. Личные данные и приватные вопросы требуют подходящего отдельного канала. Если выбран чат, используем те же термины и подписи результатов.</w:t>
+        <w:t>В открытом событии информация и обсуждение доступны не только записанным; любой пользователь платформы может задать вопрос. Ограничения для встреч по заявке выбирает команда. Администратор скрывает одно сообщение, сохраняя событие и остальные сообщения.</w:t>
       </w:r>
     </w:p>
     <w:p>
@@ -6284,7 +6183,7 @@
         <w:rPr>
           <w:b w:val="0"/>
         </w:rPr>
-        <w:t>Действие называется «Снять с публикации». Перед подтверждением объясняем, что встреча исчезнет из каталога. Альтернатива — «Оставить в каталоге». После завершения показываем статус «Снято с публикации».</w:t>
+        <w:t>Администратор указывает причину для организатора. Действие «Снять с публикации» блокирует новую запись и убирает встречу из выдачи для записи. Допустимый вариант постановки — удаление. Автор и записанные видят, что публикация недоступна.</w:t>
       </w:r>
     </w:p>
     <w:p>
@@ -6300,7 +6199,7 @@
         <w:rPr>
           <w:b w:val="0"/>
         </w:rPr>
-        <w:t>Снятие с публикации, отмена встречи и удаление записи — отдельные действия. Доступ по прямой ссылке, уведомления участникам и возможность вернуть публикацию задаются продуктовой политикой. Существенные последствия сообщаются до подтверждения действия.</w:t>
+        <w:t>По прямой ссылке тоже нельзя присоединиться или подать заявку. Судьбу существующих записей определяет команда. Уведомления и восстановление публикации дополнительны. Отмена встречи и снятие с публикации имеют разные последствия.</w:t>
       </w:r>
     </w:p>
     <w:p>
@@ -6313,7 +6212,7 @@
           <w:color w:val="5C616A"/>
           <w:sz w:val="17"/>
         </w:rPr>
-        <w:t>Сценарии 5 и 6. Блок вопросов — дизайн-вариант, а не закреплённая критерием механика. На макете снятие управляет видимостью в каталоге.</w:t>
+        <w:t>Сценарии 5 и 6. Обсуждение внутри платформы и модерация обязательны. Данные и доступ меняются в работающем прототипе, а не только в макете.</w:t>
       </w:r>
     </w:p>
     <w:p>
@@ -6456,7 +6355,7 @@
           <w:color w:val="5C616A"/>
           <w:sz w:val="17"/>
         </w:rPr>
-        <w:t>Это направление развития продукта. Состав функций приложения определяется командой; шесть основных сценариев сохраняют общий язык независимо от платформы.</w:t>
+        <w:t>Нативное приложение не требуется и не даёт дополнительных баллов. Приоритет — адаптивный веб и обязательные сценарии. Приложение и уведомления — развитие команды.</w:t>
       </w:r>
     </w:p>
     <w:p>
@@ -6593,7 +6492,7 @@
           <w:b w:val="0"/>
           <w:sz w:val="17"/>
         </w:rPr>
-        <w:t>[4] Критерии оценки со слайда: шесть сценариев. Исходник сохранён в проекте: docs/references/evaluation-criteria.png.</w:t>
+        <w:t>[4] Первичные PDF: docs/references/official/assignment.pdf и evaluation-criteria.pdf. Полные конверсии: docs/requirements/. Приёмка: docs/product/acceptance.md.</w:t>
       </w:r>
     </w:p>
     <w:p>
@@ -6606,7 +6505,7 @@
           <w:color w:val="5C616A"/>
           <w:sz w:val="17"/>
         </w:rPr>
-        <w:t>Версия 1.1 — основа для дизайна продукта. Проверка доступности выполняется на работающих экранах; готовое соответствие стандарту этим документом не заявляется.</w:t>
+        <w:t>Версия 1.2 — основа для дизайна продукта. Проверка доступности выполняется на работающих экранах; готовое соответствие стандарту этим документом не заявляется.</w:t>
       </w:r>
     </w:p>
     <w:sectPr>
@@ -6633,7 +6532,7 @@
         <w:color w:val="5C616A"/>
         <w:sz w:val="16"/>
       </w:rPr>
-      <w:t xml:space="preserve">РЯДОМ   /   БРЕНДБУК 1.1   /   </w:t>
+      <w:t xml:space="preserve">РЯДОМ   /   БРЕНДБУК 1.2   /   </w:t>
     </w:r>
     <w:fldSimple w:instr="PAGE"/>
   </w:p>

</xml_diff>